<commit_message>
Resume: Risk Operations Analyst, Financial Crimes Programs @ Stripe (MNC)
</commit_message>
<xml_diff>
--- a/resumes/Resume_Risk_Operations_Analyst__Financial__Stripe__MNC_.docx
+++ b/resumes/Resume_Risk_Operations_Analyst__Financial__Stripe__MNC_.docx
@@ -117,7 +117,7 @@
         <w:pBdr>
           <w:bottom w:val="single" w:sz="6" w:space="1" w:color="000000"/>
         </w:pBdr>
-        <w:spacing w:before="128" w:after="0"/>
+        <w:spacing w:before="157" w:after="0"/>
       </w:pPr>
       <w:r>
         <w:rPr>
@@ -295,7 +295,7 @@
     </w:p>
     <w:p>
       <w:pPr>
-        <w:spacing w:before="27" w:after="27"/>
+        <w:spacing w:before="34" w:after="34"/>
       </w:pPr>
     </w:p>
     <w:p>
@@ -303,7 +303,7 @@
         <w:pBdr>
           <w:bottom w:val="single" w:sz="6" w:space="1" w:color="000000"/>
         </w:pBdr>
-        <w:spacing w:before="128" w:after="0"/>
+        <w:spacing w:before="157" w:after="0"/>
       </w:pPr>
       <w:r>
         <w:rPr>
@@ -421,16 +421,16 @@
           <w:ilvl w:val="0"/>
           <w:numId w:val="2"/>
         </w:numPr>
-        <w:spacing w:before="13" w:after="35"/>
-      </w:pPr>
-      <w:r>
-        <w:rPr>
-          <w:rFonts w:ascii="Source Sans Pro" w:eastAsia="Source Sans Pro" w:hAnsi="Source Sans Pro" w:cs="Source Sans Pro"/>
-          <w:color w:val="000000"/>
-          <w:sz w:val="19"/>
-          <w:szCs w:val="19"/>
-        </w:rPr>
-        <w:t>Triaged 50+ weekly inventory reimbursement cases by severity and policy, reducing repeat-issue investigation time.</w:t>
+        <w:spacing w:before="13" w:after="41"/>
+      </w:pPr>
+      <w:r>
+        <w:rPr>
+          <w:rFonts w:ascii="Source Sans Pro" w:eastAsia="Source Sans Pro" w:hAnsi="Source Sans Pro" w:cs="Source Sans Pro"/>
+          <w:color w:val="000000"/>
+          <w:sz w:val="19"/>
+          <w:szCs w:val="19"/>
+        </w:rPr>
+        <w:t>Triaged 50+ weekly inventory reimbursement cases by severity and policy eligibility, identifying high-risk cases for senior reviewer escalation.</w:t>
       </w:r>
     </w:p>
     <w:p>
@@ -440,16 +440,16 @@
           <w:ilvl w:val="0"/>
           <w:numId w:val="2"/>
         </w:numPr>
-        <w:spacing w:before="13" w:after="35"/>
-      </w:pPr>
-      <w:r>
-        <w:rPr>
-          <w:rFonts w:ascii="Source Sans Pro" w:eastAsia="Source Sans Pro" w:hAnsi="Source Sans Pro" w:cs="Source Sans Pro"/>
-          <w:color w:val="000000"/>
-          <w:sz w:val="19"/>
-          <w:szCs w:val="19"/>
-        </w:rPr>
-        <w:t>Investigated seller claims, identified policy violations and anomalous patterns, and escalated findings to senior reviewers, ensuring risk prioritization and compliance tracking.</w:t>
+        <w:spacing w:before="13" w:after="41"/>
+      </w:pPr>
+      <w:r>
+        <w:rPr>
+          <w:rFonts w:ascii="Source Sans Pro" w:eastAsia="Source Sans Pro" w:hAnsi="Source Sans Pro" w:cs="Source Sans Pro"/>
+          <w:color w:val="000000"/>
+          <w:sz w:val="19"/>
+          <w:szCs w:val="19"/>
+        </w:rPr>
+        <w:t>Investigated seller claims, conducting root cause analysis to identify policy violations and anomalous patterns.</w:t>
       </w:r>
     </w:p>
     <w:p>
@@ -459,16 +459,16 @@
           <w:ilvl w:val="0"/>
           <w:numId w:val="2"/>
         </w:numPr>
-        <w:spacing w:before="13" w:after="35"/>
-      </w:pPr>
-      <w:r>
-        <w:rPr>
-          <w:rFonts w:ascii="Source Sans Pro" w:eastAsia="Source Sans Pro" w:hAnsi="Source Sans Pro" w:cs="Source Sans Pro"/>
-          <w:color w:val="000000"/>
-          <w:sz w:val="19"/>
-          <w:szCs w:val="19"/>
-        </w:rPr>
-        <w:t>Analyzed root cause of seller claims, documenting investigation findings, decisions, evidence notes, and corrective actions in audit-ready case notes, maintaining control evidence and decision trails.</w:t>
+        <w:spacing w:before="13" w:after="41"/>
+      </w:pPr>
+      <w:r>
+        <w:rPr>
+          <w:rFonts w:ascii="Source Sans Pro" w:eastAsia="Source Sans Pro" w:hAnsi="Source Sans Pro" w:cs="Source Sans Pro"/>
+          <w:color w:val="000000"/>
+          <w:sz w:val="19"/>
+          <w:szCs w:val="19"/>
+        </w:rPr>
+        <w:t>Analyzed 200+ weekly cases to detect recurring fraud patterns, reducing repeat-issue investigation time before escalation.</w:t>
       </w:r>
     </w:p>
     <w:p>
@@ -478,16 +478,16 @@
           <w:ilvl w:val="0"/>
           <w:numId w:val="2"/>
         </w:numPr>
-        <w:spacing w:before="13" w:after="35"/>
-      </w:pPr>
-      <w:r>
-        <w:rPr>
-          <w:rFonts w:ascii="Source Sans Pro" w:eastAsia="Source Sans Pro" w:hAnsi="Source Sans Pro" w:cs="Source Sans Pro"/>
-          <w:color w:val="000000"/>
-          <w:sz w:val="19"/>
-          <w:szCs w:val="19"/>
-        </w:rPr>
-        <w:t>Detected recurring fraud patterns across 200+ weekly cases, flagging them early and reducing repeat-issue investigation time before escalation, demonstrating risk prioritization and SLA discipline.</w:t>
+        <w:spacing w:before="13" w:after="41"/>
+      </w:pPr>
+      <w:r>
+        <w:rPr>
+          <w:rFonts w:ascii="Source Sans Pro" w:eastAsia="Source Sans Pro" w:hAnsi="Source Sans Pro" w:cs="Source Sans Pro"/>
+          <w:color w:val="000000"/>
+          <w:sz w:val="19"/>
+          <w:szCs w:val="19"/>
+        </w:rPr>
+        <w:t>Documented audit-ready case notes, recording investigation findings, decisions, evidence, and corrective actions for compliance tracking.</w:t>
       </w:r>
     </w:p>
     <w:p>
@@ -495,7 +495,7 @@
         <w:pBdr>
           <w:bottom w:val="single" w:sz="6" w:space="1" w:color="000000"/>
         </w:pBdr>
-        <w:spacing w:before="27" w:after="27"/>
+        <w:spacing w:before="34" w:after="34"/>
         <w:rPr>
           <w:rFonts w:ascii="Source Sans Pro" w:eastAsia="Source Sans Pro" w:hAnsi="Source Sans Pro" w:cs="Source Sans Pro"/>
           <w:b/>
@@ -511,7 +511,7 @@
         <w:pBdr>
           <w:bottom w:val="single" w:sz="6" w:space="1" w:color="000000"/>
         </w:pBdr>
-        <w:spacing w:before="128" w:after="0"/>
+        <w:spacing w:before="157" w:after="0"/>
       </w:pPr>
       <w:r>
         <w:rPr>
@@ -542,7 +542,7 @@
             <w:szCs w:val="19"/>
             <w:u w:val="single"/>
           </w:rPr>
-          <w:t>Risk Operations Analyst, Financial Crimes</w:t>
+          <w:t>Risk Operations Analyst, Financial Crimes Programs</w:t>
         </w:r>
       </w:hyperlink>
       <w:r>
@@ -579,16 +579,16 @@
           <w:ilvl w:val="0"/>
           <w:numId w:val="2"/>
         </w:numPr>
-        <w:spacing w:before="13" w:after="35"/>
-      </w:pPr>
-      <w:r>
-        <w:rPr>
-          <w:rFonts w:ascii="Source Sans Pro" w:eastAsia="Source Sans Pro" w:hAnsi="Source Sans Pro" w:cs="Source Sans Pro"/>
-          <w:color w:val="000000"/>
-          <w:sz w:val="19"/>
-          <w:szCs w:val="19"/>
-        </w:rPr>
-        <w:t>Developed multi-API threat intelligence pipeline submitting suspicious URLs/IPs to VirusTotal, AbuseIPDB, and URLScan.io, cross-referencing WHOIS, DNS, and SSL data for phishing analysis.</w:t>
+        <w:spacing w:before="13" w:after="41"/>
+      </w:pPr>
+      <w:r>
+        <w:rPr>
+          <w:rFonts w:ascii="Source Sans Pro" w:eastAsia="Source Sans Pro" w:hAnsi="Source Sans Pro" w:cs="Source Sans Pro"/>
+          <w:color w:val="000000"/>
+          <w:sz w:val="19"/>
+          <w:szCs w:val="19"/>
+        </w:rPr>
+        <w:t>Built a multi-API threat intelligence pipeline to submit suspicious URLs/IPs to VirusTotal, AbuseIPDB, and URLScan.io, cross-referencing WHOIS, DNS, and SSL details for phishing analysis.</w:t>
       </w:r>
     </w:p>
     <w:p>
@@ -598,16 +598,16 @@
           <w:ilvl w:val="0"/>
           <w:numId w:val="2"/>
         </w:numPr>
-        <w:spacing w:before="13" w:after="35"/>
-      </w:pPr>
-      <w:r>
-        <w:rPr>
-          <w:rFonts w:ascii="Source Sans Pro" w:eastAsia="Source Sans Pro" w:hAnsi="Source Sans Pro" w:cs="Source Sans Pro"/>
-          <w:color w:val="000000"/>
-          <w:sz w:val="19"/>
-          <w:szCs w:val="19"/>
-        </w:rPr>
-        <w:t>Developed typosquatting detection capabilities using a domain detector that generates brand domain variants and checks live DNS resolution for brand-impersonation analysis.</w:t>
+        <w:spacing w:before="13" w:after="41"/>
+      </w:pPr>
+      <w:r>
+        <w:rPr>
+          <w:rFonts w:ascii="Source Sans Pro" w:eastAsia="Source Sans Pro" w:hAnsi="Source Sans Pro" w:cs="Source Sans Pro"/>
+          <w:color w:val="000000"/>
+          <w:sz w:val="19"/>
+          <w:szCs w:val="19"/>
+        </w:rPr>
+        <w:t>Implemented typosquatting domain detector to generate brand-impersonation variants and check live DNS resolution for risk evidence.</w:t>
       </w:r>
     </w:p>
     <w:p>
@@ -617,21 +617,21 @@
           <w:ilvl w:val="0"/>
           <w:numId w:val="2"/>
         </w:numPr>
-        <w:spacing w:before="13" w:after="35"/>
-      </w:pPr>
-      <w:r>
-        <w:rPr>
-          <w:rFonts w:ascii="Source Sans Pro" w:eastAsia="Source Sans Pro" w:hAnsi="Source Sans Pro" w:cs="Source Sans Pro"/>
-          <w:color w:val="000000"/>
-          <w:sz w:val="19"/>
-          <w:szCs w:val="19"/>
-        </w:rPr>
-        <w:t>Deployed Telegram bot interface for IOC enrichment, bulk CSV input/output, and OSINT enrichment via theHarvester for domain profiling.</w:t>
-      </w:r>
-    </w:p>
-    <w:p>
-      <w:pPr>
-        <w:spacing w:before="27" w:after="27"/>
+        <w:spacing w:before="13" w:after="41"/>
+      </w:pPr>
+      <w:r>
+        <w:rPr>
+          <w:rFonts w:ascii="Source Sans Pro" w:eastAsia="Source Sans Pro" w:hAnsi="Source Sans Pro" w:cs="Source Sans Pro"/>
+          <w:color w:val="000000"/>
+          <w:sz w:val="19"/>
+          <w:szCs w:val="19"/>
+        </w:rPr>
+        <w:t>Developed a risk operations workflow with a Telegram bot interface for IOC enrichment, bulk CSV input/output, and OSINT enrichment via theHarvester for domain profiling.</w:t>
+      </w:r>
+    </w:p>
+    <w:p>
+      <w:pPr>
+        <w:spacing w:before="34" w:after="34"/>
       </w:pPr>
     </w:p>
     <w:p>
@@ -651,7 +651,7 @@
             <w:szCs w:val="19"/>
             <w:u w:val="single"/>
           </w:rPr>
-          <w:t>Risk Operations Analyst, Financial Crimes</w:t>
+          <w:t>Risk Operations Analyst, Financial Crimes Programs</w:t>
         </w:r>
       </w:hyperlink>
       <w:r>
@@ -688,16 +688,16 @@
           <w:ilvl w:val="0"/>
           <w:numId w:val="2"/>
         </w:numPr>
-        <w:spacing w:before="13" w:after="35"/>
-      </w:pPr>
-      <w:r>
-        <w:rPr>
-          <w:rFonts w:ascii="Source Sans Pro" w:eastAsia="Source Sans Pro" w:hAnsi="Source Sans Pro" w:cs="Source Sans Pro"/>
-          <w:color w:val="000000"/>
-          <w:sz w:val="19"/>
-          <w:szCs w:val="19"/>
-        </w:rPr>
-        <w:t>Developed automated vulnerability assessment pipeline integrating Nessus and OpenVAS REST APIs in Python, classifying CVEs by CVSS severity and EPSS context from FIRST.org API.</w:t>
+        <w:spacing w:before="13" w:after="41"/>
+      </w:pPr>
+      <w:r>
+        <w:rPr>
+          <w:rFonts w:ascii="Source Sans Pro" w:eastAsia="Source Sans Pro" w:hAnsi="Source Sans Pro" w:cs="Source Sans Pro"/>
+          <w:color w:val="000000"/>
+          <w:sz w:val="19"/>
+          <w:szCs w:val="19"/>
+        </w:rPr>
+        <w:t>Developed automated vulnerability assessment pipeline integrating Nessus and OpenVAS REST APIs in Python, generating CVE reports with CVSS severity and EPSS context from FIRST.org API.</w:t>
       </w:r>
     </w:p>
     <w:p>
@@ -707,16 +707,16 @@
           <w:ilvl w:val="0"/>
           <w:numId w:val="2"/>
         </w:numPr>
-        <w:spacing w:before="13" w:after="35"/>
-      </w:pPr>
-      <w:r>
-        <w:rPr>
-          <w:rFonts w:ascii="Source Sans Pro" w:eastAsia="Source Sans Pro" w:hAnsi="Source Sans Pro" w:cs="Source Sans Pro"/>
-          <w:color w:val="000000"/>
-          <w:sz w:val="19"/>
-          <w:szCs w:val="19"/>
-        </w:rPr>
-        <w:t>Developed OWASP Top 10 automated web checker to detect injection, auth, and SSRF vulnerabilities, documenting SQL injection remediation and parameterised query best practices.</w:t>
+        <w:spacing w:before="13" w:after="41"/>
+      </w:pPr>
+      <w:r>
+        <w:rPr>
+          <w:rFonts w:ascii="Source Sans Pro" w:eastAsia="Source Sans Pro" w:hAnsi="Source Sans Pro" w:cs="Source Sans Pro"/>
+          <w:color w:val="000000"/>
+          <w:sz w:val="19"/>
+          <w:szCs w:val="19"/>
+        </w:rPr>
+        <w:t>Developed OWASP Top 10 automated web checker to detect injection, auth, and SSRF vulnerabilities, documenting SQL injection remediation.</w:t>
       </w:r>
     </w:p>
     <w:p>
@@ -726,16 +726,16 @@
           <w:ilvl w:val="0"/>
           <w:numId w:val="2"/>
         </w:numPr>
-        <w:spacing w:before="13" w:after="35"/>
-      </w:pPr>
-      <w:r>
-        <w:rPr>
-          <w:rFonts w:ascii="Source Sans Pro" w:eastAsia="Source Sans Pro" w:hAnsi="Source Sans Pro" w:cs="Source Sans Pro"/>
-          <w:color w:val="000000"/>
-          <w:sz w:val="19"/>
-          <w:szCs w:val="19"/>
-        </w:rPr>
-        <w:t>Automated scan scheduling with Bash and cron, and built delta-scan logic for CVE flagging and patch compliance tracking.</w:t>
+        <w:spacing w:before="13" w:after="41"/>
+      </w:pPr>
+      <w:r>
+        <w:rPr>
+          <w:rFonts w:ascii="Source Sans Pro" w:eastAsia="Source Sans Pro" w:hAnsi="Source Sans Pro" w:cs="Source Sans Pro"/>
+          <w:color w:val="000000"/>
+          <w:sz w:val="19"/>
+          <w:szCs w:val="19"/>
+        </w:rPr>
+        <w:t>Automated scan scheduling via Bash and cron, flagging new CVEs and tracking patch compliance evidence.</w:t>
       </w:r>
     </w:p>
     <w:p>
@@ -743,7 +743,7 @@
         <w:pBdr>
           <w:bottom w:val="single" w:sz="6" w:space="1" w:color="000000"/>
         </w:pBdr>
-        <w:spacing w:before="27" w:after="27"/>
+        <w:spacing w:before="34" w:after="34"/>
         <w:rPr>
           <w:rFonts w:ascii="Source Sans Pro" w:eastAsia="Source Sans Pro" w:hAnsi="Source Sans Pro" w:cs="Source Sans Pro"/>
           <w:b/>
@@ -759,7 +759,7 @@
         <w:pBdr>
           <w:bottom w:val="single" w:sz="6" w:space="1" w:color="000000"/>
         </w:pBdr>
-        <w:spacing w:before="128" w:after="0"/>
+        <w:spacing w:before="157" w:after="0"/>
       </w:pPr>
       <w:r>
         <w:rPr>
@@ -775,7 +775,7 @@
     </w:p>
     <w:p>
       <w:pPr>
-        <w:spacing w:before="51" w:after="51"/>
+        <w:spacing w:before="58" w:after="58"/>
       </w:pPr>
       <w:r>
         <w:rPr>
@@ -797,7 +797,7 @@
     </w:p>
     <w:p>
       <w:pPr>
-        <w:spacing w:before="51" w:after="51"/>
+        <w:spacing w:before="58" w:after="58"/>
       </w:pPr>
       <w:r>
         <w:rPr>
@@ -819,7 +819,7 @@
     </w:p>
     <w:p>
       <w:pPr>
-        <w:spacing w:before="51" w:after="51"/>
+        <w:spacing w:before="58" w:after="58"/>
       </w:pPr>
       <w:r>
         <w:rPr>
@@ -841,7 +841,7 @@
     </w:p>
     <w:p>
       <w:pPr>
-        <w:spacing w:before="51" w:after="51"/>
+        <w:spacing w:before="58" w:after="58"/>
       </w:pPr>
       <w:r>
         <w:rPr>
@@ -863,7 +863,7 @@
     </w:p>
     <w:p>
       <w:pPr>
-        <w:spacing w:before="51" w:after="51"/>
+        <w:spacing w:before="58" w:after="58"/>
       </w:pPr>
       <w:r>
         <w:rPr>
@@ -888,7 +888,7 @@
         <w:pBdr>
           <w:bottom w:val="single" w:sz="6" w:space="1" w:color="000000"/>
         </w:pBdr>
-        <w:spacing w:before="27" w:after="27"/>
+        <w:spacing w:before="34" w:after="34"/>
         <w:rPr>
           <w:rFonts w:ascii="Source Sans Pro" w:eastAsia="Source Sans Pro" w:hAnsi="Source Sans Pro" w:cs="Source Sans Pro"/>
           <w:b/>
@@ -904,7 +904,7 @@
         <w:pBdr>
           <w:bottom w:val="single" w:sz="6" w:space="1" w:color="000000"/>
         </w:pBdr>
-        <w:spacing w:before="128" w:after="0"/>
+        <w:spacing w:before="157" w:after="0"/>
       </w:pPr>
       <w:r>
         <w:rPr>
@@ -925,7 +925,7 @@
           <w:ilvl w:val="0"/>
           <w:numId w:val="2"/>
         </w:numPr>
-        <w:spacing w:before="13" w:after="35"/>
+        <w:spacing w:before="13" w:after="41"/>
       </w:pPr>
       <w:r>
         <w:rPr>
@@ -944,7 +944,7 @@
           <w:ilvl w:val="0"/>
           <w:numId w:val="2"/>
         </w:numPr>
-        <w:spacing w:before="13" w:after="35"/>
+        <w:spacing w:before="13" w:after="41"/>
       </w:pPr>
       <w:r>
         <w:rPr>

</xml_diff>